<commit_message>
Instagram scheduling working and deployment sync
</commit_message>
<xml_diff>
--- a/info.docx
+++ b/info.docx
@@ -15,8 +15,13 @@
     </w:p>
     <w:p>
       <w:r>
-        <w:t>INSTAGRAM_USERNAME=wills_custom_airbrushing</w:t>
-      </w:r>
+        <w:t>INSTAGRAM_USERNAME=</w:t>
+      </w:r>
+      <w:proofErr w:type="spellStart"/>
+      <w:r>
+        <w:t>wills_custom_airbrushing</w:t>
+      </w:r>
+      <w:proofErr w:type="spellEnd"/>
     </w:p>
     <w:p/>
     <w:p>
@@ -47,9 +52,11 @@
       </w:r>
     </w:p>
     <w:p>
+      <w:proofErr w:type="spellStart"/>
       <w:r>
         <w:t>bearerToken</w:t>
       </w:r>
+      <w:proofErr w:type="spellEnd"/>
       <w:r>
         <w:t xml:space="preserve">: </w:t>
       </w:r>
@@ -84,9 +91,14 @@
       <w:r>
         <w:t xml:space="preserve">Still need to create this: </w:t>
       </w:r>
-      <w:r>
-        <w:t>https://willscustomairbrushing.com/artboost-ai-terms</w:t>
-      </w:r>
+      <w:hyperlink r:id="rId4" w:history="1">
+        <w:r>
+          <w:rPr>
+            <w:rStyle w:val="Hyperlink"/>
+          </w:rPr>
+          <w:t>https://willscustomairbrushing.com/artboost-ai-terms</w:t>
+        </w:r>
+      </w:hyperlink>
     </w:p>
     <w:sectPr>
       <w:pgSz w:w="12240" w:h="15840"/>
@@ -1015,6 +1027,29 @@
       <w:spacing w:val="5"/>
     </w:rPr>
   </w:style>
+  <w:style w:type="character" w:styleId="Hyperlink">
+    <w:name w:val="Hyperlink"/>
+    <w:basedOn w:val="DefaultParagraphFont"/>
+    <w:uiPriority w:val="99"/>
+    <w:unhideWhenUsed/>
+    <w:rsid w:val="00536029"/>
+    <w:rPr>
+      <w:color w:val="467886" w:themeColor="hyperlink"/>
+      <w:u w:val="single"/>
+    </w:rPr>
+  </w:style>
+  <w:style w:type="character" w:styleId="UnresolvedMention">
+    <w:name w:val="Unresolved Mention"/>
+    <w:basedOn w:val="DefaultParagraphFont"/>
+    <w:uiPriority w:val="99"/>
+    <w:semiHidden/>
+    <w:unhideWhenUsed/>
+    <w:rsid w:val="00536029"/>
+    <w:rPr>
+      <w:color w:val="605E5C"/>
+      <w:shd w:val="clear" w:color="auto" w:fill="E1DFDD"/>
+    </w:rPr>
+  </w:style>
 </w:styles>
 </file>
 

</xml_diff>